<commit_message>
feat(docx): added parsing support for docx w:Br and w:lastRenderedPageBreak nodes
</commit_message>
<xml_diff>
--- a/test/files/test.docx
+++ b/test/files/test.docx
@@ -73,7 +73,11 @@
         <w:t>.</w:t>
       </w:r>
     </w:p>
-    <w:p xmlns:wp14="http://schemas.microsoft.com/office/word/2010/wordml" wp14:textId="77777777"/>
+    <w:p xmlns:wp14="http://schemas.microsoft.com/office/word/2010/wordml" wp14:textId="77777777">
+      <w:r>
+        <w:br type="page"/>
+      </w:r>
+    </w:p>
     <w:p xmlns:wp14="http://schemas.microsoft.com/office/word/2010/wordml" wp14:textId="77777777">
       <w:pPr>
         <w:pStyle w:val="Heading1"/>
@@ -99,6 +103,7 @@
     <w:p xmlns:wp14="http://schemas.microsoft.com/office/word/2010/wordml" wp14:textId="77777777">
       <w:r>
         <w:t>Here, we demonstrate various types of inline text formatting and the use of embedded fonts.</w:t>
+        <w:br/>
       </w:r>
     </w:p>
     <w:p xmlns:wp14="http://schemas.microsoft.com/office/word/2010/wordml" wp14:textId="77777777">

</xml_diff>